<commit_message>
feat(meeting): bang phan cong chia theo du an, bo tom tat AI khoi file Word
- Prompt may chu: bo chia muc A/B/C/D, gom noi dung theo tung du an
  (dong tieu de muc / dong du an co STT / dong noi dung), them co is_group.
- Template Word: them 2 hang dieu kien (tieu de muc gop o in dam, dong du an
  gop o to nen) ben canh hang noi dung 5 o cu.
- Xuat file: tinh co loai dong o may chu (bien ban cu danh dau A/B/C/D van
  in dung), khong tu danh so lai STT nua.
- Muc II khong in tom tat AI nua (da co tab "Tom tat AI" trong phan mem),
  vao thang bang phan cong; go the {meeting_summary} khoi template.
- Giao dien tab Bang phan cong hien dong du an nen xanh nhat, gop o nhu file Word.

Co-Authored-By: Claude Opus 5 <noreply@anthropic.com>
</commit_message>
<xml_diff>
--- a/dashboard/public/templates/bien_ban_hop_template_1.docx
+++ b/dashboard/public/templates/bien_ban_hop_template_1.docx
@@ -615,13 +615,6 @@
         </w:rPr>
       </w:pPr>
       <w:r>
-        <w:t>{meeting_summary}</w:t>
-      </w:r>
-      <w:r>
-        <w:br/>
-      </w:r>
-      <w:r>
-        <w:br/>
         <w:t>Sau khi thảo luận, Chủ trì cuộc họp kết luận và chỉ đạo thực hiện các đầu việc chi tiết như sau:</w:t>
       </w:r>
     </w:p>
@@ -810,6 +803,97 @@
       </w:tr>
       <w:tr>
         <w:trPr>
+          <w:trHeight w:val="397"/>
+        </w:trPr>
+        <w:tc>
+          <w:tcPr>
+            <w:tcW w:w="1064" w:type="dxa"/>
+            <w:vAlign w:val="center"/>
+          </w:tcPr>
+          <w:p>
+            <w:r>
+              <w:t xml:space="preserve">{#tasks}{#is_header}</w:t>
+            </w:r>
+          </w:p>
+        </w:tc>
+        <w:tc>
+          <w:tcPr>
+            <w:tcW w:w="9568" w:type="dxa"/>
+            <w:gridSpan w:val="4"/>
+            <w:vAlign w:val="center"/>
+          </w:tcPr>
+          <w:p>
+            <w:pPr>
+              <w:rPr>
+                <w:b/>
+                <w:bCs/>
+                <w:color w:val="1F4E79"/>
+              </w:rPr>
+            </w:pPr>
+            <w:r>
+              <w:rPr>
+                <w:b/>
+                <w:bCs/>
+                <w:color w:val="1F4E79"/>
+              </w:rPr>
+              <w:t xml:space="preserve">{content}{/is_header}</w:t>
+            </w:r>
+          </w:p>
+        </w:tc>
+      </w:tr>
+      <w:tr>
+        <w:trPr>
+          <w:trHeight w:val="397"/>
+        </w:trPr>
+        <w:tc>
+          <w:tcPr>
+            <w:tcW w:w="1064" w:type="dxa"/>
+            <w:shd w:val="clear" w:color="auto" w:fill="DEEAF6"/>
+            <w:vAlign w:val="center"/>
+          </w:tcPr>
+          <w:p>
+            <w:pPr>
+              <w:jc w:val="center"/>
+              <w:rPr>
+                <w:b/>
+                <w:bCs/>
+              </w:rPr>
+            </w:pPr>
+            <w:r>
+              <w:rPr>
+                <w:b/>
+                <w:bCs/>
+              </w:rPr>
+              <w:t xml:space="preserve">{#is_group}{stt}</w:t>
+            </w:r>
+          </w:p>
+        </w:tc>
+        <w:tc>
+          <w:tcPr>
+            <w:tcW w:w="9568" w:type="dxa"/>
+            <w:gridSpan w:val="4"/>
+            <w:shd w:val="clear" w:color="auto" w:fill="DEEAF6"/>
+            <w:vAlign w:val="center"/>
+          </w:tcPr>
+          <w:p>
+            <w:pPr>
+              <w:rPr>
+                <w:b/>
+                <w:bCs/>
+              </w:rPr>
+            </w:pPr>
+            <w:r>
+              <w:rPr>
+                <w:b/>
+                <w:bCs/>
+              </w:rPr>
+              <w:t xml:space="preserve">{content}{/is_group}</w:t>
+            </w:r>
+          </w:p>
+        </w:tc>
+      </w:tr>
+      <w:tr>
+        <w:trPr>
           <w:trHeight w:val="850"/>
         </w:trPr>
         <w:tc>
@@ -819,7 +903,7 @@
           </w:tcPr>
           <w:p>
             <w:r>
-              <w:t>{#tasks}{stt}</w:t>
+              <w:t>{#is_task}{stt}</w:t>
             </w:r>
           </w:p>
         </w:tc>
@@ -863,7 +947,7 @@
           </w:tcPr>
           <w:p>
             <w:r>
-              <w:t>{deadline}{/tasks}</w:t>
+              <w:t>{deadline}{/is_task}{/tasks}</w:t>
             </w:r>
           </w:p>
         </w:tc>

</xml_diff>